<commit_message>
Add contact person to opinion letter
Co-Authored-By: Claude Sonnet 5.5 <noreply@anthropic.com>
Claude-Session: https://claude.ai/code/session_01MdmrBNvqv8LepqLUPjtCN4
</commit_message>
<xml_diff>
--- a/검토의견서_공문.docx
+++ b/검토의견서_공문.docx
@@ -640,6 +640,20 @@
           <w:szCs w:val="30"/>
         </w:rPr>
         <w:t xml:space="preserve">동아정밀공업사 대표  윤 병 화  (직인 생략)</w:t>
+      </w:r>
+    </w:p>
+    <w:p>
+      <w:pPr>
+        <w:spacing w:before="100"/>
+        <w:jc w:val="center"/>
+      </w:pPr>
+      <w:r>
+        <w:rPr>
+          <w:rFonts w:ascii="맑은 고딕" w:cs="맑은 고딕" w:eastAsia="맑은 고딕" w:hAnsi="맑은 고딕"/>
+          <w:sz w:val="21"/>
+          <w:szCs w:val="21"/>
+        </w:rPr>
+        <w:t xml:space="preserve">담당자 : 조창현 이사 (연락처 010-9392-9397)</w:t>
       </w:r>
     </w:p>
     <w:p>

</xml_diff>

<commit_message>
Make emphasized table border thinner
Co-Authored-By: Claude Sonnet 5.5 <noreply@anthropic.com>
Claude-Session: https://claude.ai/code/session_01MdmrBNvqv8LepqLUPjtCN4
</commit_message>
<xml_diff>
--- a/검토의견서_공문.docx
+++ b/검토의견서_공문.docx
@@ -219,8 +219,8 @@
           <w:tcPr>
             <w:tcW w:type="dxa" w:w="2600"/>
             <w:tcBorders>
-              <w:top w:val="single" w:color="000000" w:sz="24"/>
-              <w:left w:val="single" w:color="000000" w:sz="24"/>
+              <w:top w:val="single" w:color="000000" w:sz="12"/>
+              <w:left w:val="single" w:color="000000" w:sz="12"/>
               <w:bottom w:val="single" w:color="808080" w:sz="4"/>
               <w:right w:val="single" w:color="808080" w:sz="4"/>
             </w:tcBorders>
@@ -254,7 +254,7 @@
           <w:tcPr>
             <w:tcW w:type="dxa" w:w="2000"/>
             <w:tcBorders>
-              <w:top w:val="single" w:color="000000" w:sz="24"/>
+              <w:top w:val="single" w:color="000000" w:sz="12"/>
               <w:left w:val="single" w:color="808080" w:sz="4"/>
               <w:bottom w:val="single" w:color="808080" w:sz="4"/>
               <w:right w:val="single" w:color="808080" w:sz="4"/>
@@ -289,10 +289,10 @@
           <w:tcPr>
             <w:tcW w:type="dxa" w:w="4426"/>
             <w:tcBorders>
-              <w:top w:val="single" w:color="000000" w:sz="24"/>
-              <w:left w:val="single" w:color="808080" w:sz="4"/>
-              <w:bottom w:val="single" w:color="808080" w:sz="4"/>
-              <w:right w:val="single" w:color="000000" w:sz="24"/>
+              <w:top w:val="single" w:color="000000" w:sz="12"/>
+              <w:left w:val="single" w:color="808080" w:sz="4"/>
+              <w:bottom w:val="single" w:color="808080" w:sz="4"/>
+              <w:right w:val="single" w:color="000000" w:sz="12"/>
             </w:tcBorders>
             <w:shd w:fill="D9E2F3" w:color="auto" w:val="clear"/>
             <w:tcMar>
@@ -327,7 +327,7 @@
             <w:tcW w:type="dxa" w:w="2600"/>
             <w:tcBorders>
               <w:top w:val="single" w:color="808080" w:sz="4"/>
-              <w:left w:val="single" w:color="000000" w:sz="24"/>
+              <w:left w:val="single" w:color="000000" w:sz="12"/>
               <w:bottom w:val="single" w:color="808080" w:sz="4"/>
               <w:right w:val="single" w:color="808080" w:sz="4"/>
             </w:tcBorders>
@@ -397,7 +397,7 @@
               <w:top w:val="single" w:color="808080" w:sz="4"/>
               <w:left w:val="single" w:color="808080" w:sz="4"/>
               <w:bottom w:val="single" w:color="808080" w:sz="4"/>
-              <w:right w:val="single" w:color="000000" w:sz="24"/>
+              <w:right w:val="single" w:color="000000" w:sz="12"/>
             </w:tcBorders>
             <w:tcMar>
               <w:top w:type="dxa" w:w="70"/>
@@ -431,8 +431,8 @@
             <w:tcW w:type="dxa" w:w="2600"/>
             <w:tcBorders>
               <w:top w:val="single" w:color="808080" w:sz="4"/>
-              <w:left w:val="single" w:color="000000" w:sz="24"/>
-              <w:bottom w:val="single" w:color="000000" w:sz="24"/>
+              <w:left w:val="single" w:color="000000" w:sz="12"/>
+              <w:bottom w:val="single" w:color="000000" w:sz="12"/>
               <w:right w:val="single" w:color="808080" w:sz="4"/>
             </w:tcBorders>
             <w:tcMar>
@@ -466,7 +466,7 @@
             <w:tcBorders>
               <w:top w:val="single" w:color="808080" w:sz="4"/>
               <w:left w:val="single" w:color="808080" w:sz="4"/>
-              <w:bottom w:val="single" w:color="000000" w:sz="24"/>
+              <w:bottom w:val="single" w:color="000000" w:sz="12"/>
               <w:right w:val="single" w:color="808080" w:sz="4"/>
             </w:tcBorders>
             <w:tcMar>
@@ -500,8 +500,8 @@
             <w:tcBorders>
               <w:top w:val="single" w:color="808080" w:sz="4"/>
               <w:left w:val="single" w:color="808080" w:sz="4"/>
-              <w:bottom w:val="single" w:color="000000" w:sz="24"/>
-              <w:right w:val="single" w:color="000000" w:sz="24"/>
+              <w:bottom w:val="single" w:color="000000" w:sz="12"/>
+              <w:right w:val="single" w:color="000000" w:sz="12"/>
             </w:tcBorders>
             <w:tcMar>
               <w:top w:type="dxa" w:w="70"/>
@@ -744,10 +744,10 @@
           <w:tcPr>
             <w:tcW w:type="dxa" w:w="3663"/>
             <w:tcBorders>
-              <w:top w:val="single" w:color="000000" w:sz="24"/>
-              <w:left w:val="single" w:color="000000" w:sz="24"/>
-              <w:bottom w:val="single" w:color="808080" w:sz="4"/>
-              <w:right w:val="single" w:color="000000" w:sz="24"/>
+              <w:top w:val="single" w:color="000000" w:sz="12"/>
+              <w:left w:val="single" w:color="000000" w:sz="12"/>
+              <w:bottom w:val="single" w:color="808080" w:sz="4"/>
+              <w:right w:val="single" w:color="000000" w:sz="12"/>
             </w:tcBorders>
             <w:shd w:fill="D9E2F3" w:color="auto" w:val="clear"/>
             <w:tcMar>
@@ -851,9 +851,9 @@
             <w:tcW w:type="dxa" w:w="3663"/>
             <w:tcBorders>
               <w:top w:val="single" w:color="808080" w:sz="4"/>
-              <w:left w:val="single" w:color="000000" w:sz="24"/>
-              <w:bottom w:val="single" w:color="808080" w:sz="4"/>
-              <w:right w:val="single" w:color="000000" w:sz="24"/>
+              <w:left w:val="single" w:color="000000" w:sz="12"/>
+              <w:bottom w:val="single" w:color="808080" w:sz="4"/>
+              <w:right w:val="single" w:color="000000" w:sz="12"/>
             </w:tcBorders>
             <w:tcMar>
               <w:top w:type="dxa" w:w="70"/>
@@ -955,9 +955,9 @@
             <w:tcW w:type="dxa" w:w="3663"/>
             <w:tcBorders>
               <w:top w:val="single" w:color="808080" w:sz="4"/>
-              <w:left w:val="single" w:color="000000" w:sz="24"/>
-              <w:bottom w:val="single" w:color="808080" w:sz="4"/>
-              <w:right w:val="single" w:color="000000" w:sz="24"/>
+              <w:left w:val="single" w:color="000000" w:sz="12"/>
+              <w:bottom w:val="single" w:color="808080" w:sz="4"/>
+              <w:right w:val="single" w:color="000000" w:sz="12"/>
             </w:tcBorders>
             <w:tcMar>
               <w:top w:type="dxa" w:w="70"/>
@@ -1059,9 +1059,9 @@
             <w:tcW w:type="dxa" w:w="3663"/>
             <w:tcBorders>
               <w:top w:val="single" w:color="808080" w:sz="4"/>
-              <w:left w:val="single" w:color="000000" w:sz="24"/>
-              <w:bottom w:val="single" w:color="808080" w:sz="4"/>
-              <w:right w:val="single" w:color="000000" w:sz="24"/>
+              <w:left w:val="single" w:color="000000" w:sz="12"/>
+              <w:bottom w:val="single" w:color="808080" w:sz="4"/>
+              <w:right w:val="single" w:color="000000" w:sz="12"/>
             </w:tcBorders>
             <w:tcMar>
               <w:top w:type="dxa" w:w="70"/>
@@ -1163,9 +1163,9 @@
             <w:tcW w:type="dxa" w:w="3663"/>
             <w:tcBorders>
               <w:top w:val="single" w:color="808080" w:sz="4"/>
-              <w:left w:val="single" w:color="000000" w:sz="24"/>
-              <w:bottom w:val="single" w:color="000000" w:sz="24"/>
-              <w:right w:val="single" w:color="000000" w:sz="24"/>
+              <w:left w:val="single" w:color="000000" w:sz="12"/>
+              <w:bottom w:val="single" w:color="000000" w:sz="12"/>
+              <w:right w:val="single" w:color="000000" w:sz="12"/>
             </w:tcBorders>
             <w:tcMar>
               <w:top w:type="dxa" w:w="70"/>

</xml_diff>

<commit_message>
Enlarge header block and bold subject line
Co-Authored-By: Claude Sonnet 5.5 <noreply@anthropic.com>
Claude-Session: https://claude.ai/code/session_01MdmrBNvqv8LepqLUPjtCN4
</commit_message>
<xml_diff>
--- a/검토의견서_공문.docx
+++ b/검토의견서_공문.docx
@@ -4,88 +4,96 @@
   <w:body>
     <w:p>
       <w:pPr>
-        <w:spacing w:after="60"/>
-        <w:ind w:left="900" w:hanging="900"/>
-      </w:pPr>
-      <w:r>
-        <w:rPr>
-          <w:rFonts w:ascii="맑은 고딕" w:cs="맑은 고딕" w:eastAsia="맑은 고딕" w:hAnsi="맑은 고딕"/>
-          <w:sz w:val="23"/>
-          <w:szCs w:val="23"/>
+        <w:spacing w:after="70"/>
+        <w:ind w:left="1000" w:hanging="1000"/>
+      </w:pPr>
+      <w:r>
+        <w:rPr>
+          <w:rFonts w:ascii="맑은 고딕" w:cs="맑은 고딕" w:eastAsia="맑은 고딕" w:hAnsi="맑은 고딕"/>
+          <w:sz w:val="27"/>
+          <w:szCs w:val="27"/>
         </w:rPr>
         <w:t xml:space="preserve">수신 : </w:t>
       </w:r>
       <w:r>
         <w:rPr>
           <w:rFonts w:ascii="맑은 고딕" w:cs="맑은 고딕" w:eastAsia="맑은 고딕" w:hAnsi="맑은 고딕"/>
-          <w:sz w:val="23"/>
-          <w:szCs w:val="23"/>
+          <w:b w:val="false"/>
+          <w:bCs w:val="false"/>
+          <w:sz w:val="27"/>
+          <w:szCs w:val="27"/>
         </w:rPr>
         <w:t xml:space="preserve">부산광역시 건설본부장</w:t>
       </w:r>
     </w:p>
     <w:p>
       <w:pPr>
-        <w:spacing w:after="60"/>
-        <w:ind w:left="900" w:hanging="900"/>
-      </w:pPr>
-      <w:r>
-        <w:rPr>
-          <w:rFonts w:ascii="맑은 고딕" w:cs="맑은 고딕" w:eastAsia="맑은 고딕" w:hAnsi="맑은 고딕"/>
-          <w:sz w:val="23"/>
-          <w:szCs w:val="23"/>
+        <w:spacing w:after="70"/>
+        <w:ind w:left="1000" w:hanging="1000"/>
+      </w:pPr>
+      <w:r>
+        <w:rPr>
+          <w:rFonts w:ascii="맑은 고딕" w:cs="맑은 고딕" w:eastAsia="맑은 고딕" w:hAnsi="맑은 고딕"/>
+          <w:sz w:val="27"/>
+          <w:szCs w:val="27"/>
         </w:rPr>
         <w:t xml:space="preserve">참조 : </w:t>
       </w:r>
       <w:r>
         <w:rPr>
           <w:rFonts w:ascii="맑은 고딕" w:cs="맑은 고딕" w:eastAsia="맑은 고딕" w:hAnsi="맑은 고딕"/>
-          <w:sz w:val="23"/>
-          <w:szCs w:val="23"/>
+          <w:b w:val="false"/>
+          <w:bCs w:val="false"/>
+          <w:sz w:val="27"/>
+          <w:szCs w:val="27"/>
         </w:rPr>
         <w:t xml:space="preserve">건설시설부장(기계2팀장)</w:t>
       </w:r>
     </w:p>
     <w:p>
       <w:pPr>
-        <w:spacing w:after="60"/>
-        <w:ind w:left="900" w:hanging="900"/>
-      </w:pPr>
-      <w:r>
-        <w:rPr>
-          <w:rFonts w:ascii="맑은 고딕" w:cs="맑은 고딕" w:eastAsia="맑은 고딕" w:hAnsi="맑은 고딕"/>
-          <w:sz w:val="23"/>
-          <w:szCs w:val="23"/>
+        <w:spacing w:after="70"/>
+        <w:ind w:left="1000" w:hanging="1000"/>
+      </w:pPr>
+      <w:r>
+        <w:rPr>
+          <w:rFonts w:ascii="맑은 고딕" w:cs="맑은 고딕" w:eastAsia="맑은 고딕" w:hAnsi="맑은 고딕"/>
+          <w:sz w:val="27"/>
+          <w:szCs w:val="27"/>
         </w:rPr>
         <w:t xml:space="preserve">일자 : </w:t>
       </w:r>
       <w:r>
         <w:rPr>
           <w:rFonts w:ascii="맑은 고딕" w:cs="맑은 고딕" w:eastAsia="맑은 고딕" w:hAnsi="맑은 고딕"/>
-          <w:sz w:val="23"/>
-          <w:szCs w:val="23"/>
+          <w:b w:val="false"/>
+          <w:bCs w:val="false"/>
+          <w:sz w:val="27"/>
+          <w:szCs w:val="27"/>
         </w:rPr>
         <w:t xml:space="preserve">2026. 10. 27.</w:t>
       </w:r>
     </w:p>
     <w:p>
       <w:pPr>
-        <w:spacing w:after="60"/>
-        <w:ind w:left="900" w:hanging="900"/>
-      </w:pPr>
-      <w:r>
-        <w:rPr>
-          <w:rFonts w:ascii="맑은 고딕" w:cs="맑은 고딕" w:eastAsia="맑은 고딕" w:hAnsi="맑은 고딕"/>
-          <w:sz w:val="23"/>
-          <w:szCs w:val="23"/>
+        <w:spacing w:after="70"/>
+        <w:ind w:left="1000" w:hanging="1000"/>
+      </w:pPr>
+      <w:r>
+        <w:rPr>
+          <w:rFonts w:ascii="맑은 고딕" w:cs="맑은 고딕" w:eastAsia="맑은 고딕" w:hAnsi="맑은 고딕"/>
+          <w:sz w:val="27"/>
+          <w:szCs w:val="27"/>
         </w:rPr>
         <w:t xml:space="preserve">건명 : </w:t>
       </w:r>
       <w:r>
         <w:rPr>
           <w:rFonts w:ascii="맑은 고딕" w:cs="맑은 고딕" w:eastAsia="맑은 고딕" w:hAnsi="맑은 고딕"/>
-          <w:sz w:val="23"/>
-          <w:szCs w:val="23"/>
+          <w:b/>
+          <w:bCs/>
+          <w:sz w:val="27"/>
+          <w:szCs w:val="27"/>
         </w:rPr>
         <w:t xml:space="preserve">대저수문 수문권양기 구매 입찰공고(안) 관련 검토의견서 제출</w:t>
       </w:r>

</xml_diff>

<commit_message>
Justify body text and align hanging indents
Co-Authored-By: Claude Sonnet 5.5 <noreply@anthropic.com>
Claude-Session: https://claude.ai/code/session_01MdmrBNvqv8LepqLUPjtCN4
</commit_message>
<xml_diff>
--- a/검토의견서_공문.docx
+++ b/검토의견서_공문.docx
@@ -107,6 +107,7 @@
       <w:pPr>
         <w:spacing w:after="80" w:line="290"/>
         <w:ind w:left="360" w:hanging="360"/>
+        <w:jc w:val="both"/>
       </w:pPr>
       <w:r>
         <w:rPr>
@@ -114,13 +115,14 @@
           <w:sz w:val="21"/>
           <w:szCs w:val="21"/>
         </w:rPr>
-        <w:t xml:space="preserve">1.  어려운 우리 부산의 지역경제활성화를 위하여 노력하시는 귀 건설본부의 무궁한 발전을 기원합니다.</w:t>
+        <w:t xml:space="preserve">1.	어려운 우리 부산의 지역경제활성화를 위하여 노력하시는 귀 건설본부의 무궁한 발전을 기원합니다.</w:t>
       </w:r>
     </w:p>
     <w:p>
       <w:pPr>
         <w:spacing w:after="80" w:line="290"/>
         <w:ind w:left="360" w:hanging="360"/>
+        <w:jc w:val="both"/>
       </w:pPr>
       <w:r>
         <w:rPr>
@@ -128,13 +130,14 @@
           <w:sz w:val="21"/>
           <w:szCs w:val="21"/>
         </w:rPr>
-        <w:t xml:space="preserve">2.  금회 발주예정인 대저수문 수문권양기 구매와 관련하여 우리 부산지역업체 입찰 참여기회 확대를 위하여 다음과 같이 검토의견서를 제출하오니 적극 검토하여 주시길 간곡히 요청드립니다.</w:t>
+        <w:t xml:space="preserve">2.	금회 발주예정인 대저수문 수문권양기 구매와 관련하여 우리 부산지역업체 입찰 참여기회 확대를 위하여 다음과 같이 검토의견서를 제출하오니 적극 검토하여 주시길 간곡히 요청드립니다.</w:t>
       </w:r>
     </w:p>
     <w:p>
       <w:pPr>
         <w:spacing w:after="80" w:line="290"/>
         <w:ind w:left="360" w:hanging="360"/>
+        <w:jc w:val="both"/>
       </w:pPr>
       <w:r>
         <w:rPr>
@@ -142,13 +145,14 @@
           <w:sz w:val="21"/>
           <w:szCs w:val="21"/>
         </w:rPr>
-        <w:t xml:space="preserve">3.  건의요청 내용</w:t>
+        <w:t xml:space="preserve">3.	건의요청 내용</w:t>
       </w:r>
     </w:p>
     <w:p>
       <w:pPr>
         <w:spacing w:after="80" w:line="290"/>
         <w:ind w:left="900" w:hanging="540"/>
+        <w:jc w:val="both"/>
       </w:pPr>
       <w:r>
         <w:rPr>
@@ -158,13 +162,14 @@
           <w:sz w:val="21"/>
           <w:szCs w:val="21"/>
         </w:rPr>
-        <w:t xml:space="preserve">가.  입찰참가자격(실적제한)</w:t>
+        <w:t xml:space="preserve">가.	입찰참가자격(실적제한)</w:t>
       </w:r>
     </w:p>
     <w:p>
       <w:pPr>
         <w:spacing w:after="80" w:line="290"/>
         <w:ind w:left="900" w:hanging="0"/>
+        <w:jc w:val="both"/>
       </w:pPr>
       <w:r>
         <w:rPr>
@@ -179,6 +184,7 @@
       <w:pPr>
         <w:spacing w:after="80" w:line="290"/>
         <w:ind w:left="900" w:hanging="540"/>
+        <w:jc w:val="both"/>
       </w:pPr>
       <w:r>
         <w:rPr>
@@ -188,13 +194,14 @@
           <w:sz w:val="21"/>
           <w:szCs w:val="21"/>
         </w:rPr>
-        <w:t xml:space="preserve">나.  계약이행능력심사 납품실적 평가기준</w:t>
+        <w:t xml:space="preserve">나.	계약이행능력심사 납품실적 평가기준</w:t>
       </w:r>
     </w:p>
     <w:p>
       <w:pPr>
         <w:spacing w:after="80" w:line="290"/>
         <w:ind w:left="900" w:hanging="0"/>
+        <w:jc w:val="both"/>
       </w:pPr>
       <w:r>
         <w:rPr>
@@ -547,6 +554,7 @@
       <w:pPr>
         <w:spacing w:after="80" w:line="290"/>
         <w:ind w:left="900" w:hanging="540"/>
+        <w:jc w:val="both"/>
       </w:pPr>
       <w:r>
         <w:rPr>
@@ -556,13 +564,14 @@
           <w:sz w:val="21"/>
           <w:szCs w:val="21"/>
         </w:rPr>
-        <w:t xml:space="preserve">다.  요청 사유</w:t>
+        <w:t xml:space="preserve">다.	요청 사유</w:t>
       </w:r>
     </w:p>
     <w:p>
       <w:pPr>
         <w:spacing w:after="80" w:line="290"/>
         <w:ind w:left="1260" w:hanging="360"/>
+        <w:jc w:val="both"/>
       </w:pPr>
       <w:r>
         <w:rPr>
@@ -570,13 +579,14 @@
           <w:sz w:val="21"/>
           <w:szCs w:val="21"/>
         </w:rPr>
-        <w:t xml:space="preserve">1)  평가기준은 계약담당자가 공고에 명시하도록 되어 있으므로(중소벤처기업부고시 제2026-80호 제6조제2항제1호가목) 동등이상 물품과 유사물품의 범위를 구체적으로 정하는 것이 평가의 객관성 확보에 필요합니다.</w:t>
+        <w:t xml:space="preserve">1)	평가기준은 계약담당자가 공고에 명시하도록 되어 있으므로(중소벤처기업부고시 제2026-80호 제6조제2항제1호가목) 동등이상 물품과 유사물품의 범위를 구체적으로 정하는 것이 평가의 객관성 확보에 필요합니다.</w:t>
       </w:r>
     </w:p>
     <w:p>
       <w:pPr>
         <w:spacing w:after="80" w:line="290"/>
         <w:ind w:left="1260" w:hanging="360"/>
+        <w:jc w:val="both"/>
       </w:pPr>
       <w:r>
         <w:rPr>
@@ -584,13 +594,14 @@
           <w:sz w:val="21"/>
           <w:szCs w:val="21"/>
         </w:rPr>
-        <w:t xml:space="preserve">2)  동등이상 물품은 성능·품질이 입찰대상 이상인 것, 유사물품은 동일 종류로서 성능·품질이 동등 미만인 것으로 정의되어 있으므로(같은 고시 [별표 1] 주석), 입찰대상의 규모(70톤)와 형식(와이어로프식)을 기준으로 구분하는 것이 고시 취지에 부합합니다.</w:t>
+        <w:t xml:space="preserve">2)	동등이상 물품은 성능·품질이 입찰대상 이상인 것, 유사물품은 동일 종류로서 성능·품질이 동등 미만인 것으로 정의되어 있으므로(같은 고시 [별표 1] 주석), 입찰대상의 규모(70톤)와 형식(와이어로프식)을 기준으로 구분하는 것이 고시 취지에 부합합니다.</w:t>
       </w:r>
     </w:p>
     <w:p>
       <w:pPr>
         <w:spacing w:after="80" w:line="290"/>
         <w:ind w:left="1260" w:hanging="360"/>
+        <w:jc w:val="both"/>
       </w:pPr>
       <w:r>
         <w:rPr>
@@ -598,7 +609,7 @@
           <w:sz w:val="21"/>
           <w:szCs w:val="21"/>
         </w:rPr>
-        <w:t xml:space="preserve">3)  유사물품의 형식을 와이어로프식, 유압식, 랙피니언식 등으로 열거하면 수문권양기 전반의 실적이 합리적으로 평가되어 공정한 경쟁이 가능합니다.</w:t>
+        <w:t xml:space="preserve">3)	유사물품의 형식을 와이어로프식, 유압식, 랙피니언식 등으로 열거하면 수문권양기 전반의 실적이 합리적으로 평가되어 공정한 경쟁이 가능합니다.</w:t>
       </w:r>
     </w:p>
     <w:p>
@@ -610,6 +621,7 @@
       <w:pPr>
         <w:spacing w:after="80" w:line="290"/>
         <w:ind w:left="900" w:hanging="900"/>
+        <w:jc w:val="both"/>
       </w:pPr>
       <w:r>
         <w:rPr>
@@ -624,6 +636,7 @@
       <w:pPr>
         <w:spacing w:after="80" w:line="290"/>
         <w:ind w:left="900" w:hanging="900"/>
+        <w:jc w:val="both"/>
       </w:pPr>
       <w:r>
         <w:rPr>

</xml_diff>

<commit_message>
Move dangling parenthesis to next line in table
Co-Authored-By: Claude Sonnet 5.5 <noreply@anthropic.com>
Claude-Session: https://claude.ai/code/session_01MdmrBNvqv8LepqLUPjtCN4
</commit_message>
<xml_diff>
--- a/검토의견서_공문.docx
+++ b/검토의견서_공문.docx
@@ -539,7 +539,18 @@
                 <w:sz w:val="20"/>
                 <w:szCs w:val="20"/>
               </w:rPr>
-              <w:t xml:space="preserve">대당 개폐용량 70톤 미만인 수문권양기(와이어로프식, 유압식, 랙피니언식 등)</w:t>
+              <w:t xml:space="preserve">대당 개폐용량 70톤 미만인 수문권양기</w:t>
+            </w:r>
+            <w:r>
+              <w:rPr>
+                <w:rFonts w:ascii="맑은 고딕" w:cs="맑은 고딕" w:eastAsia="맑은 고딕" w:hAnsi="맑은 고딕"/>
+                <w:b/>
+                <w:bCs/>
+                <w:sz w:val="20"/>
+                <w:szCs w:val="20"/>
+              </w:rPr>
+              <w:br/>
+              <w:t xml:space="preserve">(와이어로프식, 유압식, 랙피니언식 등)</w:t>
             </w:r>
           </w:p>
         </w:tc>
@@ -1001,7 +1012,8 @@
                 <w:sz w:val="20"/>
                 <w:szCs w:val="20"/>
               </w:rPr>
-              <w:t xml:space="preserve">대당 개폐용량 70톤 미만인 수문권양기(와이어로프식, 유압식, 랙피니언식 등)</w:t>
+              <w:t xml:space="preserve">대당 개폐용량 70톤 미만인 수문권양기
+(와이어로프식, 유압식, 랙피니언식 등)</w:t>
             </w:r>
           </w:p>
         </w:tc>

</xml_diff>

<commit_message>
Use regular weight for table body text
Co-Authored-By: Claude Sonnet 5.5 <noreply@anthropic.com>
Claude-Session: https://claude.ai/code/session_01MdmrBNvqv8LepqLUPjtCN4
</commit_message>
<xml_diff>
--- a/검토의견서_공문.docx
+++ b/검토의견서_공문.docx
@@ -362,8 +362,8 @@
             <w:r>
               <w:rPr>
                 <w:rFonts w:ascii="맑은 고딕" w:cs="맑은 고딕" w:eastAsia="맑은 고딕" w:hAnsi="맑은 고딕"/>
-                <w:b/>
-                <w:bCs/>
+                <w:b w:val="false"/>
+                <w:bCs w:val="false"/>
                 <w:sz w:val="20"/>
                 <w:szCs w:val="20"/>
               </w:rPr>
@@ -396,8 +396,8 @@
             <w:r>
               <w:rPr>
                 <w:rFonts w:ascii="맑은 고딕" w:cs="맑은 고딕" w:eastAsia="맑은 고딕" w:hAnsi="맑은 고딕"/>
-                <w:b/>
-                <w:bCs/>
+                <w:b w:val="false"/>
+                <w:bCs w:val="false"/>
                 <w:sz w:val="20"/>
                 <w:szCs w:val="20"/>
               </w:rPr>
@@ -430,8 +430,8 @@
             <w:r>
               <w:rPr>
                 <w:rFonts w:ascii="맑은 고딕" w:cs="맑은 고딕" w:eastAsia="맑은 고딕" w:hAnsi="맑은 고딕"/>
-                <w:b/>
-                <w:bCs/>
+                <w:b w:val="false"/>
+                <w:bCs w:val="false"/>
                 <w:sz w:val="20"/>
                 <w:szCs w:val="20"/>
               </w:rPr>
@@ -466,8 +466,8 @@
             <w:r>
               <w:rPr>
                 <w:rFonts w:ascii="맑은 고딕" w:cs="맑은 고딕" w:eastAsia="맑은 고딕" w:hAnsi="맑은 고딕"/>
-                <w:b/>
-                <w:bCs/>
+                <w:b w:val="false"/>
+                <w:bCs w:val="false"/>
                 <w:sz w:val="20"/>
                 <w:szCs w:val="20"/>
               </w:rPr>
@@ -500,8 +500,8 @@
             <w:r>
               <w:rPr>
                 <w:rFonts w:ascii="맑은 고딕" w:cs="맑은 고딕" w:eastAsia="맑은 고딕" w:hAnsi="맑은 고딕"/>
-                <w:b/>
-                <w:bCs/>
+                <w:b w:val="false"/>
+                <w:bCs w:val="false"/>
                 <w:sz w:val="20"/>
                 <w:szCs w:val="20"/>
               </w:rPr>
@@ -534,8 +534,8 @@
             <w:r>
               <w:rPr>
                 <w:rFonts w:ascii="맑은 고딕" w:cs="맑은 고딕" w:eastAsia="맑은 고딕" w:hAnsi="맑은 고딕"/>
-                <w:b/>
-                <w:bCs/>
+                <w:b w:val="false"/>
+                <w:bCs w:val="false"/>
                 <w:sz w:val="20"/>
                 <w:szCs w:val="20"/>
               </w:rPr>
@@ -544,8 +544,8 @@
             <w:r>
               <w:rPr>
                 <w:rFonts w:ascii="맑은 고딕" w:cs="맑은 고딕" w:eastAsia="맑은 고딕" w:hAnsi="맑은 고딕"/>
-                <w:b/>
-                <w:bCs/>
+                <w:b w:val="false"/>
+                <w:bCs w:val="false"/>
                 <w:sz w:val="20"/>
                 <w:szCs w:val="20"/>
               </w:rPr>
@@ -903,8 +903,8 @@
             <w:r>
               <w:rPr>
                 <w:rFonts w:ascii="맑은 고딕" w:cs="맑은 고딕" w:eastAsia="맑은 고딕" w:hAnsi="맑은 고딕"/>
-                <w:b/>
-                <w:bCs/>
+                <w:b w:val="false"/>
+                <w:bCs w:val="false"/>
                 <w:sz w:val="20"/>
                 <w:szCs w:val="20"/>
               </w:rPr>
@@ -1007,8 +1007,8 @@
             <w:r>
               <w:rPr>
                 <w:rFonts w:ascii="맑은 고딕" w:cs="맑은 고딕" w:eastAsia="맑은 고딕" w:hAnsi="맑은 고딕"/>
-                <w:b/>
-                <w:bCs/>
+                <w:b w:val="false"/>
+                <w:bCs w:val="false"/>
                 <w:sz w:val="20"/>
                 <w:szCs w:val="20"/>
               </w:rPr>
@@ -1112,8 +1112,8 @@
             <w:r>
               <w:rPr>
                 <w:rFonts w:ascii="맑은 고딕" w:cs="맑은 고딕" w:eastAsia="맑은 고딕" w:hAnsi="맑은 고딕"/>
-                <w:b/>
-                <w:bCs/>
+                <w:b w:val="false"/>
+                <w:bCs w:val="false"/>
                 <w:sz w:val="20"/>
                 <w:szCs w:val="20"/>
               </w:rPr>
@@ -1216,8 +1216,8 @@
             <w:r>
               <w:rPr>
                 <w:rFonts w:ascii="맑은 고딕" w:cs="맑은 고딕" w:eastAsia="맑은 고딕" w:hAnsi="맑은 고딕"/>
-                <w:b/>
-                <w:bCs/>
+                <w:b w:val="false"/>
+                <w:bCs w:val="false"/>
                 <w:sz w:val="20"/>
                 <w:szCs w:val="20"/>
               </w:rPr>

</xml_diff>

<commit_message>
Tighten spacing around parentheses and numbers
Co-Authored-By: Claude Sonnet 5.5 <noreply@anthropic.com>
Claude-Session: https://claude.ai/code/session_01MdmrBNvqv8LepqLUPjtCN4
</commit_message>
<xml_diff>
--- a/검토의견서_공문.docx
+++ b/검토의견서_공문.docx
@@ -4,6 +4,8 @@
   <w:body>
     <w:p>
       <w:pPr>
+        <w:autoSpaceDE w:val="0"/>
+        <w:autoSpaceDN w:val="0"/>
         <w:spacing w:after="70"/>
         <w:ind w:left="1000" w:hanging="1000"/>
       </w:pPr>
@@ -28,6 +30,8 @@
     </w:p>
     <w:p>
       <w:pPr>
+        <w:autoSpaceDE w:val="0"/>
+        <w:autoSpaceDN w:val="0"/>
         <w:spacing w:after="70"/>
         <w:ind w:left="1000" w:hanging="1000"/>
       </w:pPr>
@@ -52,6 +56,8 @@
     </w:p>
     <w:p>
       <w:pPr>
+        <w:autoSpaceDE w:val="0"/>
+        <w:autoSpaceDN w:val="0"/>
         <w:spacing w:after="70"/>
         <w:ind w:left="1000" w:hanging="1000"/>
       </w:pPr>
@@ -76,6 +82,8 @@
     </w:p>
     <w:p>
       <w:pPr>
+        <w:autoSpaceDE w:val="0"/>
+        <w:autoSpaceDN w:val="0"/>
         <w:spacing w:after="70"/>
         <w:ind w:left="1000" w:hanging="1000"/>
       </w:pPr>
@@ -100,14 +108,18 @@
     </w:p>
     <w:p>
       <w:pPr>
+        <w:autoSpaceDE w:val="0"/>
+        <w:autoSpaceDN w:val="0"/>
         <w:spacing w:after="120"/>
       </w:pPr>
     </w:p>
     <w:p>
       <w:pPr>
+        <w:autoSpaceDE w:val="0"/>
+        <w:autoSpaceDN w:val="0"/>
         <w:spacing w:after="80" w:line="290"/>
         <w:ind w:left="360" w:hanging="360"/>
-        <w:jc w:val="both"/>
+        <w:jc w:val="left"/>
       </w:pPr>
       <w:r>
         <w:rPr>
@@ -120,9 +132,11 @@
     </w:p>
     <w:p>
       <w:pPr>
+        <w:autoSpaceDE w:val="0"/>
+        <w:autoSpaceDN w:val="0"/>
         <w:spacing w:after="80" w:line="290"/>
         <w:ind w:left="360" w:hanging="360"/>
-        <w:jc w:val="both"/>
+        <w:jc w:val="left"/>
       </w:pPr>
       <w:r>
         <w:rPr>
@@ -135,9 +149,11 @@
     </w:p>
     <w:p>
       <w:pPr>
+        <w:autoSpaceDE w:val="0"/>
+        <w:autoSpaceDN w:val="0"/>
         <w:spacing w:after="80" w:line="290"/>
         <w:ind w:left="360" w:hanging="360"/>
-        <w:jc w:val="both"/>
+        <w:jc w:val="left"/>
       </w:pPr>
       <w:r>
         <w:rPr>
@@ -150,9 +166,11 @@
     </w:p>
     <w:p>
       <w:pPr>
+        <w:autoSpaceDE w:val="0"/>
+        <w:autoSpaceDN w:val="0"/>
         <w:spacing w:after="80" w:line="290"/>
         <w:ind w:left="900" w:hanging="540"/>
-        <w:jc w:val="both"/>
+        <w:jc w:val="left"/>
       </w:pPr>
       <w:r>
         <w:rPr>
@@ -167,9 +185,11 @@
     </w:p>
     <w:p>
       <w:pPr>
+        <w:autoSpaceDE w:val="0"/>
+        <w:autoSpaceDN w:val="0"/>
         <w:spacing w:after="80" w:line="290"/>
         <w:ind w:left="900" w:hanging="0"/>
-        <w:jc w:val="both"/>
+        <w:jc w:val="left"/>
       </w:pPr>
       <w:r>
         <w:rPr>
@@ -177,14 +197,16 @@
           <w:sz w:val="21"/>
           <w:szCs w:val="21"/>
         </w:rPr>
-        <w:t xml:space="preserve">입찰참가자격을 제한하는 경우 「지방자치단체를 당사자로 하는 계약에 관한 법률 시행령」 제20조제1항제3호에 따라 제한사항과 기준을 입찰공고에 명시하여 주시고, 실적 기간은 「지방자치단체 입찰 및 계약 집행기준」(행정안전부예규)에 따라 특별한 사유가 없는 한 입찰공고일 전일까지 검사가 완료된 최근 10년 이내의 실적으로 하여 주시기 바랍니다.</w:t>
-      </w:r>
-    </w:p>
-    <w:p>
-      <w:pPr>
+        <w:t xml:space="preserve">입찰참가자격을 제한하는 경우 지방자치단체를 당사자로 하는 계약에 관한 법률 시행령 제20조제1항제3호에 따라 제한사항과 기준을 입찰공고에 명시하여 주시고, 실적 기간은 지방자치단체 입찰 및 계약 집행기준(행정안전부예규)에 따라 특별한 사유가 없는 한 입찰공고일 전일까지 검사가 완료된 최근 10년 이내의 실적으로 하여 주시기 바랍니다.</w:t>
+      </w:r>
+    </w:p>
+    <w:p>
+      <w:pPr>
+        <w:autoSpaceDE w:val="0"/>
+        <w:autoSpaceDN w:val="0"/>
         <w:spacing w:after="80" w:line="290"/>
         <w:ind w:left="900" w:hanging="540"/>
-        <w:jc w:val="both"/>
+        <w:jc w:val="left"/>
       </w:pPr>
       <w:r>
         <w:rPr>
@@ -199,9 +221,11 @@
     </w:p>
     <w:p>
       <w:pPr>
+        <w:autoSpaceDE w:val="0"/>
+        <w:autoSpaceDN w:val="0"/>
         <w:spacing w:after="80" w:line="290"/>
         <w:ind w:left="900" w:hanging="0"/>
-        <w:jc w:val="both"/>
+        <w:jc w:val="left"/>
       </w:pPr>
       <w:r>
         <w:rPr>
@@ -250,6 +274,8 @@
           </w:tcPr>
           <w:p>
             <w:pPr>
+              <w:autoSpaceDE w:val="0"/>
+              <w:autoSpaceDN w:val="0"/>
               <w:spacing w:after="0"/>
               <w:jc w:val="center"/>
             </w:pPr>
@@ -285,6 +311,8 @@
           </w:tcPr>
           <w:p>
             <w:pPr>
+              <w:autoSpaceDE w:val="0"/>
+              <w:autoSpaceDN w:val="0"/>
               <w:spacing w:after="0"/>
               <w:jc w:val="center"/>
             </w:pPr>
@@ -320,8 +348,10 @@
           </w:tcPr>
           <w:p>
             <w:pPr>
-              <w:spacing w:after="0"/>
-              <w:jc w:val="left"/>
+              <w:autoSpaceDE w:val="0"/>
+              <w:autoSpaceDN w:val="0"/>
+              <w:spacing w:after="0"/>
+              <w:jc w:val="center"/>
             </w:pPr>
             <w:r>
               <w:rPr>
@@ -356,6 +386,8 @@
           </w:tcPr>
           <w:p>
             <w:pPr>
+              <w:autoSpaceDE w:val="0"/>
+              <w:autoSpaceDN w:val="0"/>
               <w:spacing w:after="0"/>
               <w:jc w:val="center"/>
             </w:pPr>
@@ -367,7 +399,18 @@
                 <w:sz w:val="20"/>
                 <w:szCs w:val="20"/>
               </w:rPr>
-              <w:t xml:space="preserve">최근 5년 이내 납품실적 (동등이상 물품)</w:t>
+              <w:t xml:space="preserve">최근 5년 이내 납품실적</w:t>
+            </w:r>
+            <w:r>
+              <w:rPr>
+                <w:rFonts w:ascii="맑은 고딕" w:cs="맑은 고딕" w:eastAsia="맑은 고딕" w:hAnsi="맑은 고딕"/>
+                <w:b w:val="false"/>
+                <w:bCs w:val="false"/>
+                <w:sz w:val="20"/>
+                <w:szCs w:val="20"/>
+              </w:rPr>
+              <w:br/>
+              <w:t xml:space="preserve">(동등이상 물품)</w:t>
             </w:r>
           </w:p>
         </w:tc>
@@ -390,6 +433,8 @@
           </w:tcPr>
           <w:p>
             <w:pPr>
+              <w:autoSpaceDE w:val="0"/>
+              <w:autoSpaceDN w:val="0"/>
               <w:spacing w:after="0"/>
               <w:jc w:val="center"/>
             </w:pPr>
@@ -424,6 +469,8 @@
           </w:tcPr>
           <w:p>
             <w:pPr>
+              <w:autoSpaceDE w:val="0"/>
+              <w:autoSpaceDN w:val="0"/>
               <w:spacing w:after="0"/>
               <w:jc w:val="left"/>
             </w:pPr>
@@ -460,6 +507,8 @@
           </w:tcPr>
           <w:p>
             <w:pPr>
+              <w:autoSpaceDE w:val="0"/>
+              <w:autoSpaceDN w:val="0"/>
               <w:spacing w:after="0"/>
               <w:jc w:val="center"/>
             </w:pPr>
@@ -471,7 +520,18 @@
                 <w:sz w:val="20"/>
                 <w:szCs w:val="20"/>
               </w:rPr>
-              <w:t xml:space="preserve">최근 5년 이내 납품실적 (유사물품)</w:t>
+              <w:t xml:space="preserve">최근 5년 이내 납품실적</w:t>
+            </w:r>
+            <w:r>
+              <w:rPr>
+                <w:rFonts w:ascii="맑은 고딕" w:cs="맑은 고딕" w:eastAsia="맑은 고딕" w:hAnsi="맑은 고딕"/>
+                <w:b w:val="false"/>
+                <w:bCs w:val="false"/>
+                <w:sz w:val="20"/>
+                <w:szCs w:val="20"/>
+              </w:rPr>
+              <w:br/>
+              <w:t xml:space="preserve">(유사물품)</w:t>
             </w:r>
           </w:p>
         </w:tc>
@@ -494,6 +554,8 @@
           </w:tcPr>
           <w:p>
             <w:pPr>
+              <w:autoSpaceDE w:val="0"/>
+              <w:autoSpaceDN w:val="0"/>
               <w:spacing w:after="0"/>
               <w:jc w:val="center"/>
             </w:pPr>
@@ -528,6 +590,8 @@
           </w:tcPr>
           <w:p>
             <w:pPr>
+              <w:autoSpaceDE w:val="0"/>
+              <w:autoSpaceDN w:val="0"/>
               <w:spacing w:after="0"/>
               <w:jc w:val="left"/>
             </w:pPr>
@@ -558,14 +622,18 @@
     </w:tbl>
     <w:p>
       <w:pPr>
+        <w:autoSpaceDE w:val="0"/>
+        <w:autoSpaceDN w:val="0"/>
         <w:spacing w:after="80"/>
       </w:pPr>
     </w:p>
     <w:p>
       <w:pPr>
+        <w:autoSpaceDE w:val="0"/>
+        <w:autoSpaceDN w:val="0"/>
         <w:spacing w:after="80" w:line="290"/>
         <w:ind w:left="900" w:hanging="540"/>
-        <w:jc w:val="both"/>
+        <w:jc w:val="left"/>
       </w:pPr>
       <w:r>
         <w:rPr>
@@ -580,9 +648,11 @@
     </w:p>
     <w:p>
       <w:pPr>
+        <w:autoSpaceDE w:val="0"/>
+        <w:autoSpaceDN w:val="0"/>
         <w:spacing w:after="80" w:line="290"/>
         <w:ind w:left="1260" w:hanging="360"/>
-        <w:jc w:val="both"/>
+        <w:jc w:val="left"/>
       </w:pPr>
       <w:r>
         <w:rPr>
@@ -595,9 +665,11 @@
     </w:p>
     <w:p>
       <w:pPr>
+        <w:autoSpaceDE w:val="0"/>
+        <w:autoSpaceDN w:val="0"/>
         <w:spacing w:after="80" w:line="290"/>
         <w:ind w:left="1260" w:hanging="360"/>
-        <w:jc w:val="both"/>
+        <w:jc w:val="left"/>
       </w:pPr>
       <w:r>
         <w:rPr>
@@ -610,9 +682,11 @@
     </w:p>
     <w:p>
       <w:pPr>
+        <w:autoSpaceDE w:val="0"/>
+        <w:autoSpaceDN w:val="0"/>
         <w:spacing w:after="80" w:line="290"/>
         <w:ind w:left="1260" w:hanging="360"/>
-        <w:jc w:val="both"/>
+        <w:jc w:val="left"/>
       </w:pPr>
       <w:r>
         <w:rPr>
@@ -625,14 +699,18 @@
     </w:p>
     <w:p>
       <w:pPr>
+        <w:autoSpaceDE w:val="0"/>
+        <w:autoSpaceDN w:val="0"/>
         <w:spacing w:after="80"/>
       </w:pPr>
     </w:p>
     <w:p>
       <w:pPr>
+        <w:autoSpaceDE w:val="0"/>
+        <w:autoSpaceDN w:val="0"/>
         <w:spacing w:after="80" w:line="290"/>
         <w:ind w:left="900" w:hanging="900"/>
-        <w:jc w:val="both"/>
+        <w:jc w:val="left"/>
       </w:pPr>
       <w:r>
         <w:rPr>
@@ -645,9 +723,11 @@
     </w:p>
     <w:p>
       <w:pPr>
+        <w:autoSpaceDE w:val="0"/>
+        <w:autoSpaceDN w:val="0"/>
         <w:spacing w:after="80" w:line="290"/>
         <w:ind w:left="900" w:hanging="900"/>
-        <w:jc w:val="both"/>
+        <w:jc w:val="left"/>
       </w:pPr>
       <w:r>
         <w:rPr>
@@ -660,6 +740,8 @@
     </w:p>
     <w:p>
       <w:pPr>
+        <w:autoSpaceDE w:val="0"/>
+        <w:autoSpaceDN w:val="0"/>
         <w:spacing w:before="240"/>
         <w:jc w:val="center"/>
       </w:pPr>
@@ -676,6 +758,8 @@
     </w:p>
     <w:p>
       <w:pPr>
+        <w:autoSpaceDE w:val="0"/>
+        <w:autoSpaceDN w:val="0"/>
         <w:spacing w:before="100"/>
         <w:jc w:val="center"/>
       </w:pPr>
@@ -691,6 +775,8 @@
     <w:p>
       <w:pPr>
         <w:pageBreakBefore/>
+        <w:autoSpaceDE w:val="0"/>
+        <w:autoSpaceDN w:val="0"/>
         <w:spacing w:after="200"/>
       </w:pPr>
       <w:r>
@@ -706,6 +792,8 @@
     </w:p>
     <w:p>
       <w:pPr>
+        <w:autoSpaceDE w:val="0"/>
+        <w:autoSpaceDN w:val="0"/>
         <w:spacing w:after="160"/>
       </w:pPr>
       <w:r>
@@ -757,6 +845,8 @@
           </w:tcPr>
           <w:p>
             <w:pPr>
+              <w:autoSpaceDE w:val="0"/>
+              <w:autoSpaceDN w:val="0"/>
               <w:spacing w:after="0"/>
               <w:jc w:val="center"/>
             </w:pPr>
@@ -792,6 +882,8 @@
           </w:tcPr>
           <w:p>
             <w:pPr>
+              <w:autoSpaceDE w:val="0"/>
+              <w:autoSpaceDN w:val="0"/>
               <w:spacing w:after="0"/>
               <w:jc w:val="center"/>
             </w:pPr>
@@ -827,6 +919,8 @@
           </w:tcPr>
           <w:p>
             <w:pPr>
+              <w:autoSpaceDE w:val="0"/>
+              <w:autoSpaceDN w:val="0"/>
               <w:spacing w:after="0"/>
               <w:jc w:val="center"/>
             </w:pPr>
@@ -863,6 +957,8 @@
           </w:tcPr>
           <w:p>
             <w:pPr>
+              <w:autoSpaceDE w:val="0"/>
+              <w:autoSpaceDN w:val="0"/>
               <w:spacing w:after="0"/>
               <w:jc w:val="center"/>
             </w:pPr>
@@ -897,6 +993,8 @@
           </w:tcPr>
           <w:p>
             <w:pPr>
+              <w:autoSpaceDE w:val="0"/>
+              <w:autoSpaceDN w:val="0"/>
               <w:spacing w:after="0"/>
               <w:jc w:val="left"/>
             </w:pPr>
@@ -931,6 +1029,8 @@
           </w:tcPr>
           <w:p>
             <w:pPr>
+              <w:autoSpaceDE w:val="0"/>
+              <w:autoSpaceDN w:val="0"/>
               <w:spacing w:after="0"/>
               <w:jc w:val="left"/>
             </w:pPr>
@@ -967,6 +1067,8 @@
           </w:tcPr>
           <w:p>
             <w:pPr>
+              <w:autoSpaceDE w:val="0"/>
+              <w:autoSpaceDN w:val="0"/>
               <w:spacing w:after="0"/>
               <w:jc w:val="center"/>
             </w:pPr>
@@ -1001,6 +1103,8 @@
           </w:tcPr>
           <w:p>
             <w:pPr>
+              <w:autoSpaceDE w:val="0"/>
+              <w:autoSpaceDN w:val="0"/>
               <w:spacing w:after="0"/>
               <w:jc w:val="left"/>
             </w:pPr>
@@ -1012,8 +1116,7 @@
                 <w:sz w:val="20"/>
                 <w:szCs w:val="20"/>
               </w:rPr>
-              <w:t xml:space="preserve">대당 개폐용량 70톤 미만인 수문권양기
-(와이어로프식, 유압식, 랙피니언식 등)</w:t>
+              <w:t xml:space="preserve">대당 개폐용량 70톤 미만인 수문권양기(와이어로프식, 유압식, 랙피니언식 등)</w:t>
             </w:r>
           </w:p>
         </w:tc>
@@ -1036,6 +1139,8 @@
           </w:tcPr>
           <w:p>
             <w:pPr>
+              <w:autoSpaceDE w:val="0"/>
+              <w:autoSpaceDN w:val="0"/>
               <w:spacing w:after="0"/>
               <w:jc w:val="left"/>
             </w:pPr>
@@ -1072,6 +1177,8 @@
           </w:tcPr>
           <w:p>
             <w:pPr>
+              <w:autoSpaceDE w:val="0"/>
+              <w:autoSpaceDN w:val="0"/>
               <w:spacing w:after="0"/>
               <w:jc w:val="center"/>
             </w:pPr>
@@ -1106,6 +1213,8 @@
           </w:tcPr>
           <w:p>
             <w:pPr>
+              <w:autoSpaceDE w:val="0"/>
+              <w:autoSpaceDN w:val="0"/>
               <w:spacing w:after="0"/>
               <w:jc w:val="left"/>
             </w:pPr>
@@ -1140,6 +1249,8 @@
           </w:tcPr>
           <w:p>
             <w:pPr>
+              <w:autoSpaceDE w:val="0"/>
+              <w:autoSpaceDN w:val="0"/>
               <w:spacing w:after="0"/>
               <w:jc w:val="left"/>
             </w:pPr>
@@ -1176,6 +1287,8 @@
           </w:tcPr>
           <w:p>
             <w:pPr>
+              <w:autoSpaceDE w:val="0"/>
+              <w:autoSpaceDN w:val="0"/>
               <w:spacing w:after="0"/>
               <w:jc w:val="center"/>
             </w:pPr>
@@ -1210,6 +1323,8 @@
           </w:tcPr>
           <w:p>
             <w:pPr>
+              <w:autoSpaceDE w:val="0"/>
+              <w:autoSpaceDN w:val="0"/>
               <w:spacing w:after="0"/>
               <w:jc w:val="left"/>
             </w:pPr>
@@ -1244,6 +1359,8 @@
           </w:tcPr>
           <w:p>
             <w:pPr>
+              <w:autoSpaceDE w:val="0"/>
+              <w:autoSpaceDN w:val="0"/>
               <w:spacing w:after="0"/>
               <w:jc w:val="left"/>
             </w:pPr>
@@ -1263,6 +1380,8 @@
     </w:tbl>
     <w:p>
       <w:pPr>
+        <w:autoSpaceDE w:val="0"/>
+        <w:autoSpaceDN w:val="0"/>
         <w:spacing w:after="160" w:before="360"/>
       </w:pPr>
       <w:r>
@@ -1278,6 +1397,8 @@
     </w:p>
     <w:p>
       <w:pPr>
+        <w:autoSpaceDE w:val="0"/>
+        <w:autoSpaceDN w:val="0"/>
         <w:spacing w:after="160"/>
       </w:pPr>
       <w:r>
@@ -1328,6 +1449,8 @@
           </w:tcPr>
           <w:p>
             <w:pPr>
+              <w:autoSpaceDE w:val="0"/>
+              <w:autoSpaceDN w:val="0"/>
               <w:spacing w:after="0"/>
               <w:jc w:val="center"/>
             </w:pPr>
@@ -1363,6 +1486,8 @@
           </w:tcPr>
           <w:p>
             <w:pPr>
+              <w:autoSpaceDE w:val="0"/>
+              <w:autoSpaceDN w:val="0"/>
               <w:spacing w:after="0"/>
               <w:jc w:val="center"/>
             </w:pPr>
@@ -1399,6 +1524,8 @@
           </w:tcPr>
           <w:p>
             <w:pPr>
+              <w:autoSpaceDE w:val="0"/>
+              <w:autoSpaceDN w:val="0"/>
               <w:spacing w:after="0"/>
               <w:jc w:val="center"/>
             </w:pPr>
@@ -1433,6 +1560,8 @@
           </w:tcPr>
           <w:p>
             <w:pPr>
+              <w:autoSpaceDE w:val="0"/>
+              <w:autoSpaceDN w:val="0"/>
               <w:spacing w:after="0"/>
               <w:jc w:val="left"/>
             </w:pPr>
@@ -1469,6 +1598,8 @@
           </w:tcPr>
           <w:p>
             <w:pPr>
+              <w:autoSpaceDE w:val="0"/>
+              <w:autoSpaceDN w:val="0"/>
               <w:spacing w:after="0"/>
               <w:jc w:val="center"/>
             </w:pPr>
@@ -1503,6 +1634,8 @@
           </w:tcPr>
           <w:p>
             <w:pPr>
+              <w:autoSpaceDE w:val="0"/>
+              <w:autoSpaceDN w:val="0"/>
               <w:spacing w:after="0"/>
               <w:jc w:val="left"/>
             </w:pPr>
@@ -1539,6 +1672,8 @@
           </w:tcPr>
           <w:p>
             <w:pPr>
+              <w:autoSpaceDE w:val="0"/>
+              <w:autoSpaceDN w:val="0"/>
               <w:spacing w:after="0"/>
               <w:jc w:val="center"/>
             </w:pPr>
@@ -1573,6 +1708,8 @@
           </w:tcPr>
           <w:p>
             <w:pPr>
+              <w:autoSpaceDE w:val="0"/>
+              <w:autoSpaceDN w:val="0"/>
               <w:spacing w:after="0"/>
               <w:jc w:val="left"/>
             </w:pPr>
@@ -1609,6 +1746,8 @@
           </w:tcPr>
           <w:p>
             <w:pPr>
+              <w:autoSpaceDE w:val="0"/>
+              <w:autoSpaceDN w:val="0"/>
               <w:spacing w:after="0"/>
               <w:jc w:val="center"/>
             </w:pPr>
@@ -1643,6 +1782,8 @@
           </w:tcPr>
           <w:p>
             <w:pPr>
+              <w:autoSpaceDE w:val="0"/>
+              <w:autoSpaceDN w:val="0"/>
               <w:spacing w:after="0"/>
               <w:jc w:val="left"/>
             </w:pPr>
@@ -1679,6 +1820,8 @@
           </w:tcPr>
           <w:p>
             <w:pPr>
+              <w:autoSpaceDE w:val="0"/>
+              <w:autoSpaceDN w:val="0"/>
               <w:spacing w:after="0"/>
               <w:jc w:val="center"/>
             </w:pPr>
@@ -1713,6 +1856,8 @@
           </w:tcPr>
           <w:p>
             <w:pPr>
+              <w:autoSpaceDE w:val="0"/>
+              <w:autoSpaceDN w:val="0"/>
               <w:spacing w:after="0"/>
               <w:jc w:val="left"/>
             </w:pPr>
@@ -1732,6 +1877,8 @@
     </w:tbl>
     <w:p>
       <w:pPr>
+        <w:autoSpaceDE w:val="0"/>
+        <w:autoSpaceDN w:val="0"/>
         <w:spacing w:before="160"/>
       </w:pPr>
       <w:r>

</xml_diff>